<commit_message>
minor changes + docs
</commit_message>
<xml_diff>
--- a/docs/Katona Zalán - Záródolgozat.docx
+++ b/docs/Katona Zalán - Záródolgozat.docx
@@ -3681,11 +3681,12 @@
     <w:uiPriority w:val="9"/>
     <w:unhideWhenUsed/>
     <w:qFormat/>
-    <w:rsid w:val="00CA022A"/>
+    <w:rsid w:val="005E1527"/>
     <w:pPr>
       <w:keepNext/>
       <w:keepLines/>
       <w:spacing w:before="160" w:after="80"/>
+      <w:jc w:val="center"/>
       <w:outlineLvl w:val="1"/>
     </w:pPr>
     <w:rPr>
@@ -3702,7 +3703,7 @@
     <w:uiPriority w:val="9"/>
     <w:unhideWhenUsed/>
     <w:qFormat/>
-    <w:rsid w:val="00715AB8"/>
+    <w:rsid w:val="0073718E"/>
     <w:pPr>
       <w:keepNext/>
       <w:keepLines/>
@@ -3711,8 +3712,8 @@
     </w:pPr>
     <w:rPr>
       <w:rFonts w:eastAsiaTheme="majorEastAsia" w:cstheme="majorBidi"/>
-      <w:color w:val="0F4761" w:themeColor="accent1" w:themeShade="BF"/>
-      <w:sz w:val="28"/>
+      <w:b/>
+      <w:color w:val="000000" w:themeColor="text1"/>
       <w:szCs w:val="28"/>
     </w:rPr>
   </w:style>
@@ -3891,7 +3892,7 @@
     <w:basedOn w:val="Bekezdsalapbettpusa"/>
     <w:link w:val="Cmsor2"/>
     <w:uiPriority w:val="9"/>
-    <w:rsid w:val="00CA022A"/>
+    <w:rsid w:val="005E1527"/>
     <w:rPr>
       <w:rFonts w:ascii="Times New Roman" w:eastAsiaTheme="majorEastAsia" w:hAnsi="Times New Roman" w:cstheme="majorBidi"/>
       <w:sz w:val="32"/>
@@ -3903,11 +3904,12 @@
     <w:basedOn w:val="Bekezdsalapbettpusa"/>
     <w:link w:val="Cmsor3"/>
     <w:uiPriority w:val="9"/>
-    <w:rsid w:val="00715AB8"/>
+    <w:rsid w:val="0073718E"/>
     <w:rPr>
-      <w:rFonts w:eastAsiaTheme="majorEastAsia" w:cstheme="majorBidi"/>
-      <w:color w:val="0F4761" w:themeColor="accent1" w:themeShade="BF"/>
-      <w:sz w:val="28"/>
+      <w:rFonts w:ascii="Times New Roman" w:eastAsiaTheme="majorEastAsia" w:hAnsi="Times New Roman" w:cstheme="majorBidi"/>
+      <w:b/>
+      <w:color w:val="000000" w:themeColor="text1"/>
+      <w:sz w:val="24"/>
       <w:szCs w:val="28"/>
     </w:rPr>
   </w:style>

</xml_diff>

<commit_message>
middlewares reorganized, added content request validation
</commit_message>
<xml_diff>
--- a/docs/Katona Zalán - Záródolgozat.docx
+++ b/docs/Katona Zalán - Záródolgozat.docx
@@ -4070,7 +4070,7 @@
         <w:pStyle w:val="Kpalrs"/>
       </w:pPr>
       <w:fldSimple w:instr=" SEQ ábra \* ARABIC ">
-        <w:bookmarkStart w:id="7" w:name="_Toc225083804"/>
+        <w:bookmarkStart w:id="7" w:name="_Toc225241856"/>
         <w:r>
           <w:rPr>
             <w:noProof/>
@@ -4653,8 +4653,16 @@
           <w:numId w:val="16"/>
         </w:numPr>
         <w:spacing w:line="360" w:lineRule="auto"/>
-      </w:pPr>
-      <w:r>
+        <w:rPr>
+          <w:b/>
+          <w:bCs/>
+        </w:rPr>
+      </w:pPr>
+      <w:r>
+        <w:rPr>
+          <w:b/>
+          <w:bCs/>
+        </w:rPr>
         <w:t>draw.io</w:t>
       </w:r>
     </w:p>
@@ -4670,9 +4678,14 @@
       <w:pPr>
         <w:spacing w:line="360" w:lineRule="auto"/>
       </w:pPr>
-      <w:r>
-        <w:t>https://www.drawio.com/</w:t>
-      </w:r>
+      <w:hyperlink r:id="rId11" w:history="1">
+        <w:r>
+          <w:rPr>
+            <w:rStyle w:val="Hiperhivatkozs"/>
+          </w:rPr>
+          <w:t>https://www.drawio.com/</w:t>
+        </w:r>
+      </w:hyperlink>
     </w:p>
     <w:p>
       <w:r>
@@ -4742,7 +4755,7 @@
       <w:pPr>
         <w:spacing w:line="360" w:lineRule="auto"/>
       </w:pPr>
-      <w:hyperlink r:id="rId11" w:history="1">
+      <w:hyperlink r:id="rId12" w:history="1">
         <w:r>
           <w:rPr>
             <w:rStyle w:val="Hiperhivatkozs"/>
@@ -4790,7 +4803,7 @@
       <w:pPr>
         <w:spacing w:line="360" w:lineRule="auto"/>
       </w:pPr>
-      <w:hyperlink r:id="rId12" w:history="1">
+      <w:hyperlink r:id="rId13" w:history="1">
         <w:r>
           <w:rPr>
             <w:rStyle w:val="Hiperhivatkozs"/>
@@ -4841,7 +4854,7 @@
       <w:pPr>
         <w:spacing w:line="360" w:lineRule="auto"/>
       </w:pPr>
-      <w:hyperlink r:id="rId13" w:history="1">
+      <w:hyperlink r:id="rId14" w:history="1">
         <w:r>
           <w:rPr>
             <w:rStyle w:val="Hiperhivatkozs"/>
@@ -4886,7 +4899,7 @@
       <w:pPr>
         <w:spacing w:line="360" w:lineRule="auto"/>
       </w:pPr>
-      <w:hyperlink r:id="rId14" w:history="1">
+      <w:hyperlink r:id="rId15" w:history="1">
         <w:r>
           <w:rPr>
             <w:rStyle w:val="Hiperhivatkozs"/>
@@ -4928,7 +4941,7 @@
       <w:pPr>
         <w:spacing w:line="360" w:lineRule="auto"/>
       </w:pPr>
-      <w:hyperlink r:id="rId15" w:history="1">
+      <w:hyperlink r:id="rId16" w:history="1">
         <w:r>
           <w:rPr>
             <w:rStyle w:val="Hiperhivatkozs"/>
@@ -4941,7 +4954,7 @@
       <w:pPr>
         <w:spacing w:line="360" w:lineRule="auto"/>
       </w:pPr>
-      <w:hyperlink r:id="rId16" w:history="1">
+      <w:hyperlink r:id="rId17" w:history="1">
         <w:r>
           <w:rPr>
             <w:rStyle w:val="Hiperhivatkozs"/>
@@ -4992,7 +5005,7 @@
       <w:pPr>
         <w:spacing w:line="360" w:lineRule="auto"/>
       </w:pPr>
-      <w:hyperlink r:id="rId17" w:history="1">
+      <w:hyperlink r:id="rId18" w:history="1">
         <w:r>
           <w:rPr>
             <w:rStyle w:val="Hiperhivatkozs"/>
@@ -5043,7 +5056,7 @@
       <w:pPr>
         <w:spacing w:line="360" w:lineRule="auto"/>
       </w:pPr>
-      <w:hyperlink r:id="rId18" w:history="1">
+      <w:hyperlink r:id="rId19" w:history="1">
         <w:r>
           <w:rPr>
             <w:rStyle w:val="Hiperhivatkozs"/>
@@ -5056,54 +5069,12 @@
       <w:pPr>
         <w:spacing w:line="360" w:lineRule="auto"/>
       </w:pPr>
-      <w:hyperlink r:id="rId19" w:history="1">
+      <w:hyperlink r:id="rId20" w:history="1">
         <w:r>
           <w:rPr>
             <w:rStyle w:val="Hiperhivatkozs"/>
           </w:rPr>
           <w:t>https://www.npmjs.com/package/jsonwebtoken</w:t>
-        </w:r>
-      </w:hyperlink>
-    </w:p>
-    <w:p>
-      <w:pPr>
-        <w:pStyle w:val="Listaszerbekezds"/>
-        <w:numPr>
-          <w:ilvl w:val="0"/>
-          <w:numId w:val="16"/>
-        </w:numPr>
-        <w:spacing w:line="360" w:lineRule="auto"/>
-        <w:rPr>
-          <w:b/>
-          <w:bCs/>
-        </w:rPr>
-      </w:pPr>
-      <w:r>
-        <w:rPr>
-          <w:b/>
-          <w:bCs/>
-        </w:rPr>
-        <w:t>music-metadata</w:t>
-      </w:r>
-    </w:p>
-    <w:p>
-      <w:pPr>
-        <w:spacing w:line="360" w:lineRule="auto"/>
-      </w:pPr>
-      <w:r>
-        <w:t>Hangfájlok metaadatainak feldolgozására használt modul.</w:t>
-      </w:r>
-    </w:p>
-    <w:p>
-      <w:pPr>
-        <w:spacing w:line="360" w:lineRule="auto"/>
-      </w:pPr>
-      <w:hyperlink r:id="rId20" w:history="1">
-        <w:r>
-          <w:rPr>
-            <w:rStyle w:val="Hiperhivatkozs"/>
-          </w:rPr>
-          <w:t>https://www.npmjs.com/package/music-metadata</w:t>
         </w:r>
       </w:hyperlink>
     </w:p>
@@ -5391,7 +5362,6 @@
           <w:b/>
           <w:bCs/>
         </w:rPr>
-        <w:lastRenderedPageBreak/>
         <w:t>mul</w:t>
       </w:r>
       <w:r>
@@ -5444,6 +5414,7 @@
           <w:b/>
           <w:bCs/>
         </w:rPr>
+        <w:lastRenderedPageBreak/>
         <w:t>fs-extra</w:t>
       </w:r>
     </w:p>
@@ -8955,7 +8926,7 @@
         </w:rPr>
         <w:fldChar w:fldCharType="separate"/>
       </w:r>
-      <w:bookmarkStart w:id="21" w:name="_Toc225083805"/>
+      <w:bookmarkStart w:id="21" w:name="_Toc225241857"/>
       <w:r>
         <w:rPr>
           <w:noProof/>
@@ -9765,7 +9736,7 @@
         </w:rPr>
       </w:pPr>
       <w:fldSimple w:instr=" SEQ ábra \* ARABIC ">
-        <w:bookmarkStart w:id="26" w:name="_Toc225083806"/>
+        <w:bookmarkStart w:id="26" w:name="_Toc225241858"/>
         <w:r>
           <w:rPr>
             <w:noProof/>
@@ -9893,7 +9864,7 @@
         <w:pStyle w:val="Kpalrs"/>
       </w:pPr>
       <w:fldSimple w:instr=" SEQ ábra \* ARABIC ">
-        <w:bookmarkStart w:id="28" w:name="_Toc225083807"/>
+        <w:bookmarkStart w:id="28" w:name="_Toc225241859"/>
         <w:r>
           <w:rPr>
             <w:noProof/>
@@ -10022,7 +9993,7 @@
         </w:rPr>
         <w:fldChar w:fldCharType="separate"/>
       </w:r>
-      <w:bookmarkStart w:id="30" w:name="_Toc225083808"/>
+      <w:bookmarkStart w:id="30" w:name="_Toc225241860"/>
       <w:r>
         <w:rPr>
           <w:noProof/>
@@ -10152,7 +10123,7 @@
         </w:rPr>
         <w:fldChar w:fldCharType="separate"/>
       </w:r>
-      <w:bookmarkStart w:id="32" w:name="_Toc225083809"/>
+      <w:bookmarkStart w:id="32" w:name="_Toc225241861"/>
       <w:r>
         <w:rPr>
           <w:noProof/>
@@ -10362,7 +10333,7 @@
         </w:rPr>
         <w:fldChar w:fldCharType="separate"/>
       </w:r>
-      <w:bookmarkStart w:id="34" w:name="_Toc225083810"/>
+      <w:bookmarkStart w:id="34" w:name="_Toc225241862"/>
       <w:r>
         <w:rPr>
           <w:noProof/>
@@ -10511,7 +10482,7 @@
         <w:pStyle w:val="Kpalrs"/>
       </w:pPr>
       <w:fldSimple w:instr=" SEQ ábra \* ARABIC ">
-        <w:bookmarkStart w:id="37" w:name="_Toc225083811"/>
+        <w:bookmarkStart w:id="37" w:name="_Toc225241863"/>
         <w:r>
           <w:rPr>
             <w:noProof/>
@@ -10567,6 +10538,9 @@
         <w:keepNext/>
       </w:pPr>
       <w:r>
+        <w:rPr>
+          <w:noProof/>
+        </w:rPr>
         <w:drawing>
           <wp:inline distT="0" distB="0" distL="0" distR="0" wp14:anchorId="22F4B08D" wp14:editId="100726E8">
             <wp:extent cx="5759450" cy="1522095"/>
@@ -10609,7 +10583,7 @@
         <w:pStyle w:val="Kpalrs"/>
       </w:pPr>
       <w:fldSimple w:instr=" SEQ ábra \* ARABIC ">
-        <w:bookmarkStart w:id="38" w:name="_Toc225083812"/>
+        <w:bookmarkStart w:id="38" w:name="_Toc225241864"/>
         <w:r>
           <w:rPr>
             <w:noProof/>
@@ -10674,6 +10648,9 @@
         <w:keepNext/>
       </w:pPr>
       <w:r>
+        <w:rPr>
+          <w:noProof/>
+        </w:rPr>
         <w:drawing>
           <wp:inline distT="0" distB="0" distL="0" distR="0" wp14:anchorId="3486F863" wp14:editId="7464F6F1">
             <wp:extent cx="5759450" cy="1475740"/>
@@ -10719,7 +10696,7 @@
         </w:rPr>
       </w:pPr>
       <w:fldSimple w:instr=" SEQ ábra \* ARABIC ">
-        <w:bookmarkStart w:id="39" w:name="_Toc225083813"/>
+        <w:bookmarkStart w:id="39" w:name="_Toc225241865"/>
         <w:r>
           <w:rPr>
             <w:noProof/>
@@ -10873,7 +10850,7 @@
         <w:pStyle w:val="Kpalrs"/>
       </w:pPr>
       <w:fldSimple w:instr=" SEQ ábra \* ARABIC ">
-        <w:bookmarkStart w:id="41" w:name="_Toc225083814"/>
+        <w:bookmarkStart w:id="41" w:name="_Toc225241866"/>
         <w:r>
           <w:rPr>
             <w:noProof/>
@@ -11016,7 +10993,7 @@
         </w:rPr>
         <w:fldChar w:fldCharType="separate"/>
       </w:r>
-      <w:bookmarkStart w:id="42" w:name="_Toc225083815"/>
+      <w:bookmarkStart w:id="42" w:name="_Toc225241867"/>
       <w:r>
         <w:rPr>
           <w:noProof/>
@@ -11197,7 +11174,7 @@
         </w:rPr>
         <w:fldChar w:fldCharType="separate"/>
       </w:r>
-      <w:bookmarkStart w:id="43" w:name="_Toc225083816"/>
+      <w:bookmarkStart w:id="43" w:name="_Toc225241868"/>
       <w:r>
         <w:rPr>
           <w:noProof/>
@@ -11350,7 +11327,7 @@
         <w:pStyle w:val="Kpalrs"/>
       </w:pPr>
       <w:fldSimple w:instr=" SEQ ábra \* ARABIC ">
-        <w:bookmarkStart w:id="44" w:name="_Toc225083817"/>
+        <w:bookmarkStart w:id="44" w:name="_Toc225241869"/>
         <w:r>
           <w:rPr>
             <w:noProof/>
@@ -11485,7 +11462,7 @@
         </w:rPr>
         <w:fldChar w:fldCharType="separate"/>
       </w:r>
-      <w:hyperlink w:anchor="_Toc225083804" w:history="1">
+      <w:hyperlink w:anchor="_Toc225241856" w:history="1">
         <w:r>
           <w:rPr>
             <w:rStyle w:val="Hiperhivatkozs"/>
@@ -11512,7 +11489,7 @@
             <w:noProof/>
             <w:webHidden/>
           </w:rPr>
-          <w:instrText xml:space="preserve"> PAGEREF _Toc225083804 \h </w:instrText>
+          <w:instrText xml:space="preserve"> PAGEREF _Toc225241856 \h </w:instrText>
         </w:r>
         <w:r>
           <w:rPr>
@@ -11556,7 +11533,7 @@
           <w:lang w:eastAsia="hu-HU"/>
         </w:rPr>
       </w:pPr>
-      <w:hyperlink w:anchor="_Toc225083805" w:history="1">
+      <w:hyperlink w:anchor="_Toc225241857" w:history="1">
         <w:r>
           <w:rPr>
             <w:rStyle w:val="Hiperhivatkozs"/>
@@ -11591,7 +11568,7 @@
             <w:noProof/>
             <w:webHidden/>
           </w:rPr>
-          <w:instrText xml:space="preserve"> PAGEREF _Toc225083805 \h </w:instrText>
+          <w:instrText xml:space="preserve"> PAGEREF _Toc225241857 \h </w:instrText>
         </w:r>
         <w:r>
           <w:rPr>
@@ -11635,7 +11612,7 @@
           <w:lang w:eastAsia="hu-HU"/>
         </w:rPr>
       </w:pPr>
-      <w:hyperlink w:anchor="_Toc225083806" w:history="1">
+      <w:hyperlink w:anchor="_Toc225241858" w:history="1">
         <w:r>
           <w:rPr>
             <w:rStyle w:val="Hiperhivatkozs"/>
@@ -11662,7 +11639,7 @@
             <w:noProof/>
             <w:webHidden/>
           </w:rPr>
-          <w:instrText xml:space="preserve"> PAGEREF _Toc225083806 \h </w:instrText>
+          <w:instrText xml:space="preserve"> PAGEREF _Toc225241858 \h </w:instrText>
         </w:r>
         <w:r>
           <w:rPr>
@@ -11706,7 +11683,7 @@
           <w:lang w:eastAsia="hu-HU"/>
         </w:rPr>
       </w:pPr>
-      <w:hyperlink w:anchor="_Toc225083807" w:history="1">
+      <w:hyperlink w:anchor="_Toc225241859" w:history="1">
         <w:r>
           <w:rPr>
             <w:rStyle w:val="Hiperhivatkozs"/>
@@ -11733,7 +11710,7 @@
             <w:noProof/>
             <w:webHidden/>
           </w:rPr>
-          <w:instrText xml:space="preserve"> PAGEREF _Toc225083807 \h </w:instrText>
+          <w:instrText xml:space="preserve"> PAGEREF _Toc225241859 \h </w:instrText>
         </w:r>
         <w:r>
           <w:rPr>
@@ -11777,7 +11754,7 @@
           <w:lang w:eastAsia="hu-HU"/>
         </w:rPr>
       </w:pPr>
-      <w:hyperlink w:anchor="_Toc225083808" w:history="1">
+      <w:hyperlink w:anchor="_Toc225241860" w:history="1">
         <w:r>
           <w:rPr>
             <w:rStyle w:val="Hiperhivatkozs"/>
@@ -11812,7 +11789,7 @@
             <w:noProof/>
             <w:webHidden/>
           </w:rPr>
-          <w:instrText xml:space="preserve"> PAGEREF _Toc225083808 \h </w:instrText>
+          <w:instrText xml:space="preserve"> PAGEREF _Toc225241860 \h </w:instrText>
         </w:r>
         <w:r>
           <w:rPr>
@@ -11856,7 +11833,7 @@
           <w:lang w:eastAsia="hu-HU"/>
         </w:rPr>
       </w:pPr>
-      <w:hyperlink w:anchor="_Toc225083809" w:history="1">
+      <w:hyperlink w:anchor="_Toc225241861" w:history="1">
         <w:r>
           <w:rPr>
             <w:rStyle w:val="Hiperhivatkozs"/>
@@ -11891,7 +11868,7 @@
             <w:noProof/>
             <w:webHidden/>
           </w:rPr>
-          <w:instrText xml:space="preserve"> PAGEREF _Toc225083809 \h </w:instrText>
+          <w:instrText xml:space="preserve"> PAGEREF _Toc225241861 \h </w:instrText>
         </w:r>
         <w:r>
           <w:rPr>
@@ -11935,7 +11912,7 @@
           <w:lang w:eastAsia="hu-HU"/>
         </w:rPr>
       </w:pPr>
-      <w:hyperlink w:anchor="_Toc225083810" w:history="1">
+      <w:hyperlink w:anchor="_Toc225241862" w:history="1">
         <w:r>
           <w:rPr>
             <w:rStyle w:val="Hiperhivatkozs"/>
@@ -11970,7 +11947,7 @@
             <w:noProof/>
             <w:webHidden/>
           </w:rPr>
-          <w:instrText xml:space="preserve"> PAGEREF _Toc225083810 \h </w:instrText>
+          <w:instrText xml:space="preserve"> PAGEREF _Toc225241862 \h </w:instrText>
         </w:r>
         <w:r>
           <w:rPr>
@@ -12014,7 +11991,7 @@
           <w:lang w:eastAsia="hu-HU"/>
         </w:rPr>
       </w:pPr>
-      <w:hyperlink w:anchor="_Toc225083811" w:history="1">
+      <w:hyperlink w:anchor="_Toc225241863" w:history="1">
         <w:r>
           <w:rPr>
             <w:rStyle w:val="Hiperhivatkozs"/>
@@ -12041,7 +12018,7 @@
             <w:noProof/>
             <w:webHidden/>
           </w:rPr>
-          <w:instrText xml:space="preserve"> PAGEREF _Toc225083811 \h </w:instrText>
+          <w:instrText xml:space="preserve"> PAGEREF _Toc225241863 \h </w:instrText>
         </w:r>
         <w:r>
           <w:rPr>
@@ -12085,7 +12062,7 @@
           <w:lang w:eastAsia="hu-HU"/>
         </w:rPr>
       </w:pPr>
-      <w:hyperlink w:anchor="_Toc225083812" w:history="1">
+      <w:hyperlink w:anchor="_Toc225241864" w:history="1">
         <w:r>
           <w:rPr>
             <w:rStyle w:val="Hiperhivatkozs"/>
@@ -12112,7 +12089,7 @@
             <w:noProof/>
             <w:webHidden/>
           </w:rPr>
-          <w:instrText xml:space="preserve"> PAGEREF _Toc225083812 \h </w:instrText>
+          <w:instrText xml:space="preserve"> PAGEREF _Toc225241864 \h </w:instrText>
         </w:r>
         <w:r>
           <w:rPr>
@@ -12156,7 +12133,7 @@
           <w:lang w:eastAsia="hu-HU"/>
         </w:rPr>
       </w:pPr>
-      <w:hyperlink w:anchor="_Toc225083813" w:history="1">
+      <w:hyperlink w:anchor="_Toc225241865" w:history="1">
         <w:r>
           <w:rPr>
             <w:rStyle w:val="Hiperhivatkozs"/>
@@ -12183,7 +12160,7 @@
             <w:noProof/>
             <w:webHidden/>
           </w:rPr>
-          <w:instrText xml:space="preserve"> PAGEREF _Toc225083813 \h </w:instrText>
+          <w:instrText xml:space="preserve"> PAGEREF _Toc225241865 \h </w:instrText>
         </w:r>
         <w:r>
           <w:rPr>
@@ -12227,7 +12204,7 @@
           <w:lang w:eastAsia="hu-HU"/>
         </w:rPr>
       </w:pPr>
-      <w:hyperlink w:anchor="_Toc225083814" w:history="1">
+      <w:hyperlink w:anchor="_Toc225241866" w:history="1">
         <w:r>
           <w:rPr>
             <w:rStyle w:val="Hiperhivatkozs"/>
@@ -12254,7 +12231,7 @@
             <w:noProof/>
             <w:webHidden/>
           </w:rPr>
-          <w:instrText xml:space="preserve"> PAGEREF _Toc225083814 \h </w:instrText>
+          <w:instrText xml:space="preserve"> PAGEREF _Toc225241866 \h </w:instrText>
         </w:r>
         <w:r>
           <w:rPr>
@@ -12298,7 +12275,7 @@
           <w:lang w:eastAsia="hu-HU"/>
         </w:rPr>
       </w:pPr>
-      <w:hyperlink w:anchor="_Toc225083815" w:history="1">
+      <w:hyperlink w:anchor="_Toc225241867" w:history="1">
         <w:r>
           <w:rPr>
             <w:rStyle w:val="Hiperhivatkozs"/>
@@ -12333,7 +12310,7 @@
             <w:noProof/>
             <w:webHidden/>
           </w:rPr>
-          <w:instrText xml:space="preserve"> PAGEREF _Toc225083815 \h </w:instrText>
+          <w:instrText xml:space="preserve"> PAGEREF _Toc225241867 \h </w:instrText>
         </w:r>
         <w:r>
           <w:rPr>
@@ -12377,7 +12354,7 @@
           <w:lang w:eastAsia="hu-HU"/>
         </w:rPr>
       </w:pPr>
-      <w:hyperlink w:anchor="_Toc225083816" w:history="1">
+      <w:hyperlink w:anchor="_Toc225241868" w:history="1">
         <w:r>
           <w:rPr>
             <w:rStyle w:val="Hiperhivatkozs"/>
@@ -12412,7 +12389,7 @@
             <w:noProof/>
             <w:webHidden/>
           </w:rPr>
-          <w:instrText xml:space="preserve"> PAGEREF _Toc225083816 \h </w:instrText>
+          <w:instrText xml:space="preserve"> PAGEREF _Toc225241868 \h </w:instrText>
         </w:r>
         <w:r>
           <w:rPr>
@@ -12456,7 +12433,7 @@
           <w:lang w:eastAsia="hu-HU"/>
         </w:rPr>
       </w:pPr>
-      <w:hyperlink w:anchor="_Toc225083817" w:history="1">
+      <w:hyperlink w:anchor="_Toc225241869" w:history="1">
         <w:r>
           <w:rPr>
             <w:rStyle w:val="Hiperhivatkozs"/>
@@ -12483,7 +12460,7 @@
             <w:noProof/>
             <w:webHidden/>
           </w:rPr>
-          <w:instrText xml:space="preserve"> PAGEREF _Toc225083817 \h </w:instrText>
+          <w:instrText xml:space="preserve"> PAGEREF _Toc225241869 \h </w:instrText>
         </w:r>
         <w:r>
           <w:rPr>
@@ -16537,6 +16514,7 @@
   <w:style w:type="character" w:default="1" w:styleId="Bekezdsalapbettpusa">
     <w:name w:val="Default Paragraph Font"/>
     <w:uiPriority w:val="1"/>
+    <w:semiHidden/>
     <w:unhideWhenUsed/>
   </w:style>
   <w:style w:type="table" w:default="1" w:styleId="Normltblzat">

</xml_diff>